<commit_message>
Manual: merge callout continuations into a single box; full visual review pass
Co-Authored-By: Claude Fable 5.1 <noreply@anthropic.com>
Claude-Session: https://claude.ai/code/session_0178ZuDGwF6nL2kEMqDGJPFX
</commit_message>
<xml_diff>
--- a/docs/training-manual/תוכנית הכשרה לטכנאי הדמיה.docx
+++ b/docs/training-manual/תוכנית הכשרה לטכנאי הדמיה.docx
@@ -2213,7 +2213,7 @@
                 <w:szCs w:val="22"/>
                 <w:rtl/>
               </w:rPr>
-              <w:t xml:space="preserve">40</w:t>
+              <w:t xml:space="preserve">39</w:t>
             </w:r>
           </w:p>
         </w:tc>
@@ -2365,7 +2365,7 @@
                 <w:szCs w:val="22"/>
                 <w:rtl/>
               </w:rPr>
-              <w:t xml:space="preserve">42</w:t>
+              <w:t xml:space="preserve">41</w:t>
             </w:r>
           </w:p>
         </w:tc>
@@ -2455,7 +2455,7 @@
                 <w:szCs w:val="26"/>
                 <w:rtl/>
               </w:rPr>
-              <w:t xml:space="preserve">44</w:t>
+              <w:t xml:space="preserve">43</w:t>
             </w:r>
           </w:p>
         </w:tc>
@@ -2531,7 +2531,7 @@
                 <w:szCs w:val="22"/>
                 <w:rtl/>
               </w:rPr>
-              <w:t xml:space="preserve">44</w:t>
+              <w:t xml:space="preserve">43</w:t>
             </w:r>
           </w:p>
         </w:tc>
@@ -2607,7 +2607,7 @@
                 <w:szCs w:val="22"/>
                 <w:rtl/>
               </w:rPr>
-              <w:t xml:space="preserve">45</w:t>
+              <w:t xml:space="preserve">44</w:t>
             </w:r>
           </w:p>
         </w:tc>
@@ -2683,7 +2683,7 @@
                 <w:szCs w:val="22"/>
                 <w:rtl/>
               </w:rPr>
-              <w:t xml:space="preserve">46</w:t>
+              <w:t xml:space="preserve">45</w:t>
             </w:r>
           </w:p>
         </w:tc>
@@ -2759,7 +2759,7 @@
                 <w:szCs w:val="22"/>
                 <w:rtl/>
               </w:rPr>
-              <w:t xml:space="preserve">47</w:t>
+              <w:t xml:space="preserve">46</w:t>
             </w:r>
           </w:p>
         </w:tc>
@@ -2835,7 +2835,7 @@
                 <w:szCs w:val="22"/>
                 <w:rtl/>
               </w:rPr>
-              <w:t xml:space="preserve">48</w:t>
+              <w:t xml:space="preserve">47</w:t>
             </w:r>
           </w:p>
         </w:tc>
@@ -2911,7 +2911,7 @@
                 <w:szCs w:val="22"/>
                 <w:rtl/>
               </w:rPr>
-              <w:t xml:space="preserve">51</w:t>
+              <w:t xml:space="preserve">50</w:t>
             </w:r>
           </w:p>
         </w:tc>
@@ -5218,7 +5218,7 @@
         <w:spacing w:after="240"/>
         <w:jc w:val="center"/>
       </w:pPr>
-      <w:hyperlink w:history="1" r:id="rIda82ekpnj_phzfw9twai68">
+      <w:hyperlink w:history="1" r:id="rIdn9yrdgq4swwwovhivbscy">
         <w:r>
           <w:rPr>
             <w:rStyle w:val="Hyperlink"/>
@@ -5547,7 +5547,7 @@
         <w:spacing w:after="240"/>
         <w:jc w:val="center"/>
       </w:pPr>
-      <w:hyperlink w:history="1" r:id="rIdy4vnrzj8toulu5otveyip">
+      <w:hyperlink w:history="1" r:id="rIdhzxkui0dydfa4lrrbv1j_">
         <w:r>
           <w:rPr>
             <w:rStyle w:val="Hyperlink"/>
@@ -5796,7 +5796,7 @@
         <w:spacing w:after="240"/>
         <w:jc w:val="center"/>
       </w:pPr>
-      <w:hyperlink w:history="1" r:id="rId81qp2kekuqdfldaicbkl_">
+      <w:hyperlink w:history="1" r:id="rIdu6ezai55mgge3k7ozduiq">
         <w:r>
           <w:rPr>
             <w:rStyle w:val="Hyperlink"/>
@@ -17643,7 +17643,7 @@
           <w:p>
             <w:pPr>
               <w:bidi/>
-              <w:spacing w:after="0" w:line="330"/>
+              <w:spacing w:after="110" w:line="330"/>
               <w:jc w:val="start"/>
             </w:pPr>
             <w:r>
@@ -17659,52 +17659,6 @@
               <w:t xml:space="preserve">בחירת קוטר טובוס מדויק (לא קטן מדי ולא גדול מדי) מהווה חלק קריטי בכל מה שקשור לבטיחות ההרדמה של בעל החיים. השאיפה שלנו תמיד תהיה לבחור בטובוס הגדול ביותר שניתן להכניס בבטחה לקנה הנשימה של בעל החיים, וזאת משום שטובוס רחב יותר מקטין משמעותית את ההתנגדות לזרימת האוויר (Airway Resistance), ומקל על הנשימה העצמונית של בעל החיים תחת הרדמה.</w:t>
             </w:r>
           </w:p>
-        </w:tc>
-      </w:tr>
-    </w:tbl>
-    <w:p>
-      <w:pPr>
-        <w:spacing w:after="180" w:before="0"/>
-      </w:pPr>
-    </w:p>
-    <w:tbl>
-      <w:tblPr>
-        <w:bidiVisual/>
-        <w:tblW w:type="pct" w:w="100%"/>
-        <w:tblBorders>
-          <w:top w:val="none" w:color="FFFFFF" w:sz="0"/>
-          <w:left w:val="none" w:color="FFFFFF" w:sz="0"/>
-          <w:bottom w:val="none" w:color="FFFFFF" w:sz="0"/>
-          <w:right w:val="none" w:color="FFFFFF" w:sz="0"/>
-          <w:insideH w:val="none" w:color="FFFFFF" w:sz="0"/>
-          <w:insideV w:val="none" w:color="FFFFFF" w:sz="0"/>
-        </w:tblBorders>
-        <w:tblLayout w:type="fixed"/>
-      </w:tblPr>
-      <w:tblGrid>
-        <w:gridCol w:w="9640"/>
-      </w:tblGrid>
-      <w:tr>
-        <w:trPr>
-          <w:cantSplit/>
-        </w:trPr>
-        <w:tc>
-          <w:tcPr>
-            <w:tcW w:type="dxa" w:w="9640"/>
-            <w:tcBorders>
-              <w:top w:val="single" w:color="FFF5E0" w:sz="2"/>
-              <w:left w:val="single" w:color="D98E04" w:sz="30"/>
-              <w:bottom w:val="single" w:color="FFF5E0" w:sz="2"/>
-              <w:right w:val="single" w:color="FFF5E0" w:sz="2"/>
-            </w:tcBorders>
-            <w:shd w:fill="FFF5E0" w:color="auto" w:val="clear"/>
-            <w:tcMar>
-              <w:top w:type="dxa" w:w="160"/>
-              <w:left w:type="dxa" w:w="260"/>
-              <w:bottom w:type="dxa" w:w="160"/>
-              <w:right w:type="dxa" w:w="260"/>
-            </w:tcMar>
-          </w:tcPr>
           <w:p>
             <w:pPr>
               <w:bidi/>
@@ -18409,7 +18363,7 @@
           <w:p>
             <w:pPr>
               <w:bidi/>
-              <w:spacing w:after="0" w:line="330"/>
+              <w:spacing w:after="110" w:line="330"/>
               <w:jc w:val="start"/>
             </w:pPr>
             <w:r>
@@ -18449,52 +18403,6 @@
               <w:t xml:space="preserve"> כאשר בעל החיים מחובר ל - Bag. השסתום סגור אך ורק כאשר החיה מחוברת למנשם!</w:t>
             </w:r>
           </w:p>
-        </w:tc>
-      </w:tr>
-    </w:tbl>
-    <w:p>
-      <w:pPr>
-        <w:spacing w:after="180" w:before="0"/>
-      </w:pPr>
-    </w:p>
-    <w:tbl>
-      <w:tblPr>
-        <w:bidiVisual/>
-        <w:tblW w:type="pct" w:w="100%"/>
-        <w:tblBorders>
-          <w:top w:val="none" w:color="FFFFFF" w:sz="0"/>
-          <w:left w:val="none" w:color="FFFFFF" w:sz="0"/>
-          <w:bottom w:val="none" w:color="FFFFFF" w:sz="0"/>
-          <w:right w:val="none" w:color="FFFFFF" w:sz="0"/>
-          <w:insideH w:val="none" w:color="FFFFFF" w:sz="0"/>
-          <w:insideV w:val="none" w:color="FFFFFF" w:sz="0"/>
-        </w:tblBorders>
-        <w:tblLayout w:type="fixed"/>
-      </w:tblPr>
-      <w:tblGrid>
-        <w:gridCol w:w="9640"/>
-      </w:tblGrid>
-      <w:tr>
-        <w:trPr>
-          <w:cantSplit/>
-        </w:trPr>
-        <w:tc>
-          <w:tcPr>
-            <w:tcW w:type="dxa" w:w="9640"/>
-            <w:tcBorders>
-              <w:top w:val="single" w:color="FDECEA" w:sz="2"/>
-              <w:left w:val="single" w:color="C0392B" w:sz="30"/>
-              <w:bottom w:val="single" w:color="FDECEA" w:sz="2"/>
-              <w:right w:val="single" w:color="FDECEA" w:sz="2"/>
-            </w:tcBorders>
-            <w:shd w:fill="FDECEA" w:color="auto" w:val="clear"/>
-            <w:tcMar>
-              <w:top w:type="dxa" w:w="160"/>
-              <w:left w:type="dxa" w:w="260"/>
-              <w:bottom w:type="dxa" w:w="160"/>
-              <w:right w:type="dxa" w:w="260"/>
-            </w:tcMar>
-          </w:tcPr>
           <w:p>
             <w:pPr>
               <w:bidi/>
@@ -29938,7 +29846,7 @@
           <w:p>
             <w:pPr>
               <w:bidi/>
-              <w:spacing w:after="0" w:line="330"/>
+              <w:spacing w:after="110" w:line="330"/>
               <w:jc w:val="start"/>
             </w:pPr>
             <w:r>
@@ -29978,52 +29886,6 @@
               <w:t xml:space="preserve">! בווטרינריה, לעיתים קרובות המוניטור עלול להציג נתונים שגויים (בשל תנועה של החיה, שרוול לחץ דם שלא במידה הנכונה או כל סיבה אחרת).</w:t>
             </w:r>
           </w:p>
-        </w:tc>
-      </w:tr>
-    </w:tbl>
-    <w:p>
-      <w:pPr>
-        <w:spacing w:after="180" w:before="0"/>
-      </w:pPr>
-    </w:p>
-    <w:tbl>
-      <w:tblPr>
-        <w:bidiVisual/>
-        <w:tblW w:type="pct" w:w="100%"/>
-        <w:tblBorders>
-          <w:top w:val="none" w:color="FFFFFF" w:sz="0"/>
-          <w:left w:val="none" w:color="FFFFFF" w:sz="0"/>
-          <w:bottom w:val="none" w:color="FFFFFF" w:sz="0"/>
-          <w:right w:val="none" w:color="FFFFFF" w:sz="0"/>
-          <w:insideH w:val="none" w:color="FFFFFF" w:sz="0"/>
-          <w:insideV w:val="none" w:color="FFFFFF" w:sz="0"/>
-        </w:tblBorders>
-        <w:tblLayout w:type="fixed"/>
-      </w:tblPr>
-      <w:tblGrid>
-        <w:gridCol w:w="9640"/>
-      </w:tblGrid>
-      <w:tr>
-        <w:trPr>
-          <w:cantSplit/>
-        </w:trPr>
-        <w:tc>
-          <w:tcPr>
-            <w:tcW w:type="dxa" w:w="9640"/>
-            <w:tcBorders>
-              <w:top w:val="single" w:color="FDECEA" w:sz="2"/>
-              <w:left w:val="single" w:color="C0392B" w:sz="30"/>
-              <w:bottom w:val="single" w:color="FDECEA" w:sz="2"/>
-              <w:right w:val="single" w:color="FDECEA" w:sz="2"/>
-            </w:tcBorders>
-            <w:shd w:fill="FDECEA" w:color="auto" w:val="clear"/>
-            <w:tcMar>
-              <w:top w:type="dxa" w:w="160"/>
-              <w:left w:type="dxa" w:w="260"/>
-              <w:bottom w:type="dxa" w:w="160"/>
-              <w:right w:type="dxa" w:w="260"/>
-            </w:tcMar>
-          </w:tcPr>
           <w:p>
             <w:pPr>
               <w:bidi/>

</xml_diff>

<commit_message>
Manual: apply proofreading fixes, drop duplicated Acidosis section, add separate change-log PDF
Co-Authored-By: Claude Fable 5.1 <noreply@anthropic.com>
Claude-Session: https://claude.ai/code/session_0178ZuDGwF6nL2kEMqDGJPFX
</commit_message>
<xml_diff>
--- a/docs/training-manual/תוכנית הכשרה לטכנאי הדמיה.docx
+++ b/docs/training-manual/תוכנית הכשרה לטכנאי הדמיה.docx
@@ -3256,7 +3256,7 @@
           <w:szCs w:val="23"/>
           <w:rtl/>
         </w:rPr>
-        <w:t xml:space="preserve"> ענידת תג קרינה, הקפדה על יישום פרוטוקול הבטיחות הכללי והבסיסי ביותר להגנה מפני קרינה (ALARA), הקפדה על כך שאף אדם או חיה נחשפים לקרינה מיותרת, הקפדה על לבישת ציוד מגן (למשל, בעת הצורך בצילום רנטגן), הקפדה על כך שאף חפץ מתכתי לא נכנס לחדר ה - MRI</w:t>
+        <w:t xml:space="preserve"> ענידת תג קרינה, הקפדה על יישום פרוטוקול הבטיחות הכללי והבסיסי ביותר להגנה מפני קרינה (ALARA), הקפדה על כך שאף אדם או חיה לא נחשפים לקרינה מיותרת, הקפדה על לבישת ציוד מגן (למשל, בעת הצורך בצילום רנטגן), הקפדה על כך שאף חפץ מתכתי לא נכנס לחדר ה - MRI</w:t>
       </w:r>
     </w:p>
     <w:p>
@@ -3292,7 +3292,7 @@
           <w:szCs w:val="23"/>
           <w:rtl/>
         </w:rPr>
-        <w:t xml:space="preserve"> זהו אחד הקריטריונים החשובים ביותר עבור טכנאי ההדמיה. כדי שצילום רנטגן, CT או MRI ייצאו ברורים ודיאגנוסטים (כאלה שניתן להפיק מהם פרוגנוזה רפואית), החיה חייבת חייבת לשכב בזווית מדויקת (למשל: ישר לחלוטין על הגב, או מתיחה ספציפית של הרגל). הטכנאי נדרש לדעת כיצד להשיג את המנח הזה בעדינות האפשרית ועם מינימום של סטרס עבור החיה</w:t>
+        <w:t xml:space="preserve"> זהו אחד הקריטריונים החשובים ביותר עבור טכנאי ההדמיה. כדי שצילום רנטגן, CT או MRI ייצאו ברורים ודיאגנוסטים (כאלה שניתן להפיק מהם פרוגנוזה רפואית), החיה חייבת לשכב בזווית מדויקת (למשל: ישר לחלוטין על הגב, או מתיחה ספציפית של הרגל). הטכנאי נדרש לדעת כיצד להשיג את המנח הזה בעדינות האפשרית ועם מינימום של סטרס עבור החיה</w:t>
       </w:r>
     </w:p>
     <w:p>
@@ -3364,7 +3364,7 @@
           <w:szCs w:val="23"/>
           <w:rtl/>
         </w:rPr>
-        <w:t xml:space="preserve"> מדידה וניטור של מדדים חיוניים לאורך השלבים השונים של פרוצדורות המתבצעות תחת טשטוש והרדמה מלאה, מעקב אחרת מגמות של המדדים השונים, נקיטת פעולות בהתאם לסטטוס המדדים, הפעלת שיקול דעת באשר למתי המצב מחייב התערבות של רופא מרדים</w:t>
+        <w:t xml:space="preserve"> מדידה וניטור של מדדים חיוניים לאורך השלבים השונים של פרוצדורות המתבצעות תחת טשטוש והרדמה מלאה, מעקב אחר מגמות של המדדים השונים, נקיטת פעולות בהתאם לסטטוס המדדים, הפעלת שיקול דעת באשר למתי המצב מחייב התערבות של רופא מרדים</w:t>
       </w:r>
     </w:p>
     <w:p>
@@ -3554,7 +3554,7 @@
           <w:szCs w:val="23"/>
           <w:rtl/>
         </w:rPr>
-        <w:t xml:space="preserve">הלקוח/הבעלים מגיעים לביה"ח לתור שנקבע להם, מעדכנים את הקבלה שהם הגיעו והקבלה מסמנות במערכת שהתור הגיע.</w:t>
+        <w:t xml:space="preserve">הלקוח/הבעלים מגיעים לביה"ח לתור שנקבע להם, מעדכנים את הקבלה שהם הגיעו והקבלה מסמנת במערכת שהתור הגיע.</w:t>
       </w:r>
     </w:p>
     <w:p>
@@ -4619,7 +4619,7 @@
                 <w:szCs w:val="22"/>
                 <w:rtl/>
               </w:rPr>
-              <w:t xml:space="preserve">מחייב טשטוש עמוק/הרדמה מלאה של החיה, רמת קרינה גבוהה, זמינות נמוכה, עלות בדיקה גבוה</w:t>
+              <w:t xml:space="preserve">מחייב טשטוש עמוק/הרדמה מלאה של החיה, רמת קרינה גבוהה, זמינות נמוכה, עלות בדיקה גבוהה</w:t>
             </w:r>
           </w:p>
         </w:tc>
@@ -4860,7 +4860,7 @@
                 <w:szCs w:val="22"/>
                 <w:rtl/>
               </w:rPr>
-              <w:t xml:space="preserve">בדיקה ארוכה מאוד, מחייבת הרדמה מלאה של החיה, זמינות נמוכה, עלות בדיקה גבוה</w:t>
+              <w:t xml:space="preserve">בדיקה ארוכה מאוד, מחייבת הרדמה מלאה של החיה, זמינות נמוכה, עלות בדיקה גבוהה</w:t>
             </w:r>
           </w:p>
         </w:tc>
@@ -5218,7 +5218,7 @@
         <w:spacing w:after="240"/>
         <w:jc w:val="center"/>
       </w:pPr>
-      <w:hyperlink w:history="1" r:id="rIdn9yrdgq4swwwovhivbscy">
+      <w:hyperlink w:history="1" r:id="rIdjlmexeha19ue_xhum8ejo">
         <w:r>
           <w:rPr>
             <w:rStyle w:val="Hyperlink"/>
@@ -5400,7 +5400,7 @@
           <w:szCs w:val="23"/>
           <w:rtl/>
         </w:rPr>
-        <w:t xml:space="preserve"> בהנחה והכלב לא אכל עכשיו חטיף או קם משינה, לקוק שפתיים ופיהוק הם סימנים מובהקים לסטרס</w:t>
+        <w:t xml:space="preserve"> בהנחה והכלב לא אכל עכשיו חטיף או קם משינה, ליקוק שפתיים ופיהוק הם סימנים מובהקים לסטרס</w:t>
       </w:r>
     </w:p>
     <w:p>
@@ -5547,7 +5547,7 @@
         <w:spacing w:after="240"/>
         <w:jc w:val="center"/>
       </w:pPr>
-      <w:hyperlink w:history="1" r:id="rIdhzxkui0dydfa4lrrbv1j_">
+      <w:hyperlink w:history="1" r:id="rIdghdzxlurfimgey0d-fp5p">
         <w:r>
           <w:rPr>
             <w:rStyle w:val="Hyperlink"/>
@@ -5796,7 +5796,7 @@
         <w:spacing w:after="240"/>
         <w:jc w:val="center"/>
       </w:pPr>
-      <w:hyperlink w:history="1" r:id="rIdu6ezai55mgge3k7ozduiq">
+      <w:hyperlink w:history="1" r:id="rIdriuppvaewgeq0rha1dekv">
         <w:r>
           <w:rPr>
             <w:rStyle w:val="Hyperlink"/>
@@ -10645,7 +10645,7 @@
           <w:szCs w:val="23"/>
           <w:rtl/>
         </w:rPr>
-        <w:t xml:space="preserve"> דומיטור יוצר מצב של טשטוש עמוק ויציב, בזמן שהחיה נשארת רפויה ונינוחה, מה שמאפשר לנו עבוד עם החיה בצורה נוחה ובטוחה ללא התנגדות או סטרס מיותר</w:t>
+        <w:t xml:space="preserve"> דומיטור יוצר מצב של טשטוש עמוק ויציב, בזמן שהחיה נשארת רפויה ונינוחה, מה שמאפשר לנו לעבוד עם החיה בצורה נוחה ובטוחה ללא התנגדות או סטרס מיותר</w:t>
       </w:r>
     </w:p>
     <w:p>
@@ -10729,7 +10729,7 @@
           <w:szCs w:val="23"/>
           <w:rtl/>
         </w:rPr>
-        <w:t xml:space="preserve">קימו של אנטגוניסט :</w:t>
+        <w:t xml:space="preserve">קיומו של אנטגוניסט:</w:t>
       </w:r>
       <w:r>
         <w:rPr>
@@ -10837,7 +10837,7 @@
           <w:szCs w:val="23"/>
           <w:rtl/>
         </w:rPr>
-        <w:t xml:space="preserve"> התרופה מכווצת בעוצמה את כלי הדם ההיקיפיים, מה שגורם לעלייה חדה בלחץ הדם ובתגובה להאטה דרמטית בקצב הלב (</w:t>
+        <w:t xml:space="preserve"> התרופה מכווצת בעוצמה את כלי הדם ההיקפיים, מה שגורם לעלייה חדה בלחץ הדם ובתגובה להאטה דרמטית בקצב הלב (</w:t>
       </w:r>
       <w:r>
         <w:rPr>
@@ -11827,7 +11827,7 @@
                 <w:szCs w:val="24"/>
                 <w:rtl/>
               </w:rPr>
-              <w:t xml:space="preserve">Ketamin</w:t>
+              <w:t xml:space="preserve">Ketamine</w:t>
             </w:r>
           </w:p>
           <w:p>
@@ -14199,7 +14199,7 @@
           <w:szCs w:val="23"/>
           <w:rtl/>
         </w:rPr>
-        <w:t xml:space="preserve">מתן של דיפיהינדרמין לפני פעולת הדיגום, חוסם את הקולטנים של ההיסטמין, ומונע מראש את התרחבות כלי הדם, הבצקות והתכווצות דרכי הנשימה במקרה של שחרור היסטמין פתאומי.</w:t>
+        <w:t xml:space="preserve">מתן של דיפינהידרמין לפני פעולת הדיגום, חוסם את הקולטנים של ההיסטמין, ומונע מראש את התרחבות כלי הדם, הבצקות והתכווצות דרכי הנשימה במקרה של שחרור היסטמין פתאומי.</w:t>
       </w:r>
     </w:p>
     <w:p>
@@ -16496,7 +16496,7 @@
           <w:szCs w:val="23"/>
           <w:rtl/>
         </w:rPr>
-        <w:t xml:space="preserve">צינורית מאריכה (מגיעה באורכים שונים) שמחברים בין הליין הראשי לבין הונפלון. האסטנסור מעניק חופש תנועה לחיה, מונע משיכות ישירות של הליין ומאפשר לנו להזריק תרופות בקלות מבלי להזיז את הונפלון</w:t>
+        <w:t xml:space="preserve">צינורית מאריכה (מגיעה באורכים שונים) שמחברים בין הליין הראשי לבין הונפלון. האקסטנסור מעניק חופש תנועה לחיה, מונע משיכות ישירות של הליין ומאפשר לנו להזריק תרופות בקלות מבלי להזיז את הונפלון</w:t>
       </w:r>
     </w:p>
     <w:p>
@@ -16554,7 +16554,7 @@
           <w:szCs w:val="23"/>
           <w:rtl/>
         </w:rPr>
-        <w:t xml:space="preserve">האקסטנסור מאפשר לשלוט בנתיב הזרימה של הנוזלים/התרופות על ידי סיבוב הברז. למשל, להזריק תרופה במזרק ישירות לתוך הווריד תוך כדי עירוי הנוזלים, לשאוב דם, או לחבר שתי שקיות נוזלים במקביל מבלי לנתק ולחבר צינורות</w:t>
+        <w:t xml:space="preserve">הסטופקוק מאפשר לשלוט בנתיב הזרימה של הנוזלים/התרופות על ידי סיבוב הברז. למשל, להזריק תרופה במזרק ישירות לתוך הווריד תוך כדי עירוי הנוזלים, לשאוב דם, או לחבר שתי שקיות נוזלים במקביל מבלי לנתק ולחבר צינורות</w:t>
       </w:r>
     </w:p>
     <w:p>
@@ -19548,7 +19548,7 @@
           <w:szCs w:val="25"/>
           <w:rtl/>
         </w:rPr>
-        <w:t xml:space="preserve">אנגלזיה (Analgesia)</w:t>
+        <w:t xml:space="preserve">אנלגזיה (Analgesia)</w:t>
       </w:r>
     </w:p>
     <w:p>
@@ -20407,7 +20407,7 @@
           <w:szCs w:val="23"/>
           <w:rtl/>
         </w:rPr>
-        <w:t xml:space="preserve">החדרת צינור תוך-קני (טובוס) דרך הפה והלוע אל תוך תוך קנה הנשימה (Trachea).</w:t>
+        <w:t xml:space="preserve">החדרת צינור תוך-קני (טובוס) דרך הפה והלוע אל תוך קנה הנשימה (Trachea).</w:t>
       </w:r>
     </w:p>
     <w:p>
@@ -22336,213 +22336,6 @@
       <w:pPr>
         <w:keepNext/>
         <w:bidi/>
-        <w:spacing w:after="100" w:before="300" w:line="300"/>
-        <w:jc w:val="start"/>
-      </w:pPr>
-      <w:r>
-        <w:rPr>
-          <w:rFonts w:ascii="Heebo" w:cs="Heebo" w:eastAsia="Heebo" w:hAnsi="Heebo"/>
-          <w:b/>
-          <w:bCs/>
-          <w:color w:val="166A6A"/>
-          <w:sz w:val="25"/>
-          <w:szCs w:val="25"/>
-          <w:rtl/>
-        </w:rPr>
-        <w:t xml:space="preserve">חמצת (Acidosis)</w:t>
-      </w:r>
-    </w:p>
-    <w:p>
-      <w:pPr>
-        <w:bidi/>
-        <w:spacing w:after="140" w:before="0" w:line="336"/>
-        <w:jc w:val="start"/>
-      </w:pPr>
-      <w:r>
-        <w:rPr>
-          <w:rFonts w:ascii="Assistant" w:cs="Assistant" w:eastAsia="Assistant" w:hAnsi="Assistant"/>
-          <w:b w:val="false"/>
-          <w:bCs w:val="false"/>
-          <w:color w:val="2B3945"/>
-          <w:sz w:val="23"/>
-          <w:szCs w:val="23"/>
-          <w:rtl/>
-        </w:rPr>
-        <w:t xml:space="preserve">מצב שבו הדם ונוזלי הגוף הופכים לחומציים מדי, כלומר, ה - pH של הדם יורד מתחת לטווח התקין.</w:t>
-      </w:r>
-    </w:p>
-    <w:p>
-      <w:pPr>
-        <w:pStyle w:val="ListParagraph"/>
-        <w:numPr>
-          <w:ilvl w:val="0"/>
-          <w:numId w:val="2"/>
-        </w:numPr>
-        <w:bidi/>
-        <w:spacing w:after="100" w:line="330"/>
-        <w:jc w:val="start"/>
-      </w:pPr>
-      <w:r>
-        <w:rPr>
-          <w:rFonts w:ascii="Assistant" w:cs="Assistant" w:eastAsia="Assistant" w:hAnsi="Assistant"/>
-          <w:b/>
-          <w:bCs/>
-          <w:color w:val="2B3945"/>
-          <w:sz w:val="23"/>
-          <w:szCs w:val="23"/>
-          <w:rtl/>
-        </w:rPr>
-        <w:t xml:space="preserve">הבעיה:</w:t>
-      </w:r>
-      <w:r>
-        <w:rPr>
-          <w:rFonts w:ascii="Assistant" w:cs="Assistant" w:eastAsia="Assistant" w:hAnsi="Assistant"/>
-          <w:b w:val="false"/>
-          <w:bCs w:val="false"/>
-          <w:color w:val="2B3945"/>
-          <w:sz w:val="23"/>
-          <w:szCs w:val="23"/>
-          <w:rtl/>
-        </w:rPr>
-        <w:t xml:space="preserve"> התאים בגוף מתפקדים בצורה מיטבית רק בסביבה נייטרלית ומאוזנת מאוד. מצב של אצידוזיס משבש את הפעילות הכימית של התאים, מוריד את היעילות של כיווץ הלב, ומחליש את התגובה של כלי הדם לתרופות.</w:t>
-      </w:r>
-    </w:p>
-    <w:p>
-      <w:pPr>
-        <w:pStyle w:val="ListParagraph"/>
-        <w:numPr>
-          <w:ilvl w:val="0"/>
-          <w:numId w:val="2"/>
-        </w:numPr>
-        <w:bidi/>
-        <w:spacing w:after="100" w:line="330"/>
-        <w:jc w:val="start"/>
-      </w:pPr>
-      <w:r>
-        <w:rPr>
-          <w:rFonts w:ascii="Assistant" w:cs="Assistant" w:eastAsia="Assistant" w:hAnsi="Assistant"/>
-          <w:b/>
-          <w:bCs/>
-          <w:color w:val="2B3945"/>
-          <w:sz w:val="23"/>
-          <w:szCs w:val="23"/>
-          <w:rtl/>
-        </w:rPr>
-        <w:t xml:space="preserve">סוגים עיקריים שרואים בפרוצדרות בהרדמה מלאה:</w:t>
-      </w:r>
-    </w:p>
-    <w:p>
-      <w:pPr>
-        <w:pStyle w:val="ListParagraph"/>
-        <w:numPr>
-          <w:ilvl w:val="1"/>
-          <w:numId w:val="2"/>
-        </w:numPr>
-        <w:bidi/>
-        <w:spacing w:after="100" w:line="330"/>
-        <w:jc w:val="start"/>
-      </w:pPr>
-      <w:r>
-        <w:rPr>
-          <w:rFonts w:ascii="Assistant" w:cs="Assistant" w:eastAsia="Assistant" w:hAnsi="Assistant"/>
-          <w:b/>
-          <w:bCs/>
-          <w:color w:val="2B3945"/>
-          <w:sz w:val="23"/>
-          <w:szCs w:val="23"/>
-          <w:rtl/>
-        </w:rPr>
-        <w:t xml:space="preserve">אצידוזיס נשימתי:</w:t>
-      </w:r>
-      <w:r>
-        <w:rPr>
-          <w:rFonts w:ascii="Assistant" w:cs="Assistant" w:eastAsia="Assistant" w:hAnsi="Assistant"/>
-          <w:b w:val="false"/>
-          <w:bCs w:val="false"/>
-          <w:color w:val="2B3945"/>
-          <w:sz w:val="23"/>
-          <w:szCs w:val="23"/>
-          <w:rtl/>
-        </w:rPr>
-        <w:t xml:space="preserve"> נגרם כאשר החיה אינה מאווררת את הריאות כראוי (תת-אוורור/Hypoventilation) ופחמן דו-חמצני (CO2) הצטבר בדם והפך לחומצה פחמתית</w:t>
-      </w:r>
-    </w:p>
-    <w:p>
-      <w:pPr>
-        <w:pStyle w:val="ListParagraph"/>
-        <w:numPr>
-          <w:ilvl w:val="1"/>
-          <w:numId w:val="2"/>
-        </w:numPr>
-        <w:bidi/>
-        <w:spacing w:after="100" w:line="330"/>
-        <w:jc w:val="start"/>
-      </w:pPr>
-      <w:r>
-        <w:rPr>
-          <w:rFonts w:ascii="Assistant" w:cs="Assistant" w:eastAsia="Assistant" w:hAnsi="Assistant"/>
-          <w:b/>
-          <w:bCs/>
-          <w:color w:val="2B3945"/>
-          <w:sz w:val="23"/>
-          <w:szCs w:val="23"/>
-          <w:rtl/>
-        </w:rPr>
-        <w:t xml:space="preserve">אצידוזיס מטבולי:</w:t>
-      </w:r>
-      <w:r>
-        <w:rPr>
-          <w:rFonts w:ascii="Assistant" w:cs="Assistant" w:eastAsia="Assistant" w:hAnsi="Assistant"/>
-          <w:b w:val="false"/>
-          <w:bCs w:val="false"/>
-          <w:color w:val="2B3945"/>
-          <w:sz w:val="23"/>
-          <w:szCs w:val="23"/>
-          <w:rtl/>
-        </w:rPr>
-        <w:t xml:space="preserve"> נגרם כתוצאה מזרימת דם לקויה לרקמות (למשל בזמן לחץ דם נמוך ממושך או שוק), המאלץ את התאים לייצר אנרגיה ללא חמצן ולהפריש חומצה לקטית</w:t>
-      </w:r>
-    </w:p>
-    <w:p>
-      <w:pPr>
-        <w:pStyle w:val="ListParagraph"/>
-        <w:numPr>
-          <w:ilvl w:val="0"/>
-          <w:numId w:val="2"/>
-        </w:numPr>
-        <w:bidi/>
-        <w:spacing w:after="100" w:line="330"/>
-        <w:jc w:val="start"/>
-      </w:pPr>
-      <w:r>
-        <w:rPr>
-          <w:rFonts w:ascii="Assistant" w:cs="Assistant" w:eastAsia="Assistant" w:hAnsi="Assistant"/>
-          <w:b/>
-          <w:bCs/>
-          <w:color w:val="2B3945"/>
-          <w:sz w:val="23"/>
-          <w:szCs w:val="23"/>
-          <w:rtl/>
-        </w:rPr>
-        <w:t xml:space="preserve">התוצאה:</w:t>
-      </w:r>
-      <w:r>
-        <w:rPr>
-          <w:rFonts w:ascii="Assistant" w:cs="Assistant" w:eastAsia="Assistant" w:hAnsi="Assistant"/>
-          <w:b w:val="false"/>
-          <w:bCs w:val="false"/>
-          <w:color w:val="2B3945"/>
-          <w:sz w:val="23"/>
-          <w:szCs w:val="23"/>
-          <w:rtl/>
-        </w:rPr>
-        <w:t xml:space="preserve"> דיכוי של מערכת העצבים והלב, נשימות עמוקות ומהירות (כניסיון של הגוף לפלוט CO2 ולפצות על החומציות), וירידה בתגובה להחייאה או לתרופות</w:t>
-      </w:r>
-    </w:p>
-    <w:p>
-      <w:pPr>
-        <w:keepNext/>
-        <w:bidi/>
         <w:spacing w:after="80" w:before="220" w:line="300"/>
         <w:jc w:val="start"/>
       </w:pPr>
@@ -23001,7 +22794,7 @@
           <w:szCs w:val="23"/>
           <w:rtl/>
         </w:rPr>
-        <w:t xml:space="preserve">הנשמה ידנית (SIgh):</w:t>
+        <w:t xml:space="preserve">הנשמה ידנית (Sigh):</w:t>
       </w:r>
       <w:r>
         <w:rPr>
@@ -24315,7 +24108,7 @@
           <w:szCs w:val="23"/>
           <w:rtl/>
         </w:rPr>
-        <w:t xml:space="preserve"> נקרוזיס הוא מוות תאי בלתי פתאומי וחריף. קרום התא נפגע, התא מתנפח ומתפוצץ, ותוכנו הפנימי דולף לסביבה המקיפה אותו. דליפה זו מעוררת תגובה דלקתית חריפה ברקמה הבריאה שסביבו, המחמירה את הנזק הקיים.</w:t>
+        <w:t xml:space="preserve"> נקרוזיס הוא מוות תאי פתאומי וחריף. קרום התא נפגע, התא מתנפח ומתפוצץ, ותוכנו הפנימי דולף לסביבה המקיפה אותו. דליפה זו מעוררת תגובה דלקתית חריפה ברקמה הבריאה שסביבו, המחמירה את הנזק הקיים.</w:t>
       </w:r>
     </w:p>
     <w:p>
@@ -24802,7 +24595,7 @@
           <w:szCs w:val="23"/>
           <w:rtl/>
         </w:rPr>
-        <w:t xml:space="preserve">Ellbow Dysplasia -</w:t>
+        <w:t xml:space="preserve">Elbow Dysplasia -</w:t>
       </w:r>
       <w:r>
         <w:rPr>
@@ -25716,7 +25509,7 @@
           <w:szCs w:val="23"/>
           <w:rtl/>
         </w:rPr>
-        <w:t xml:space="preserve"> העיניים "קופצות" או מרצדות מצד לצד, למעלה-למטה, או בתנועה מעגלית. ניסטגמוס יכול להיות סימן קלאסי לפגיעה במערכת הוסטיבולרית (מערכת שיווי המשקל, שנמצאת באוזן הפנימית או במוח), אך יכול להיות גם תופעת לוואי חולפת של תרופות טשטוש/הרדמה כמו מידזאזולם, או שילוב של מידאזולם עם קטמין.</w:t>
+        <w:t xml:space="preserve"> העיניים "קופצות" או מרצדות מצד לצד, למעלה-למטה, או בתנועה מעגלית. ניסטגמוס יכול להיות סימן קלאסי לפגיעה במערכת הוסטיבולרית (מערכת שיווי המשקל, שנמצאת באוזן הפנימית או במוח), אך יכול להיות גם תופעת לוואי חולפת של תרופות טשטוש/הרדמה כמו מידאזולם, או שילוב של מידאזולם עם קטמין.</w:t>
       </w:r>
     </w:p>
     <w:p>
@@ -25755,7 +25548,7 @@
           <w:szCs w:val="23"/>
           <w:rtl/>
         </w:rPr>
-        <w:t xml:space="preserve">טפיל נמטודי (תולעת עגולה) פתוגני, ייחודי ונפוץ מאוד בישראל, הגורם למחלה קשה כלבים.</w:t>
+        <w:t xml:space="preserve">טפיל נמטודי (תולעת עגולה) פתוגני, ייחודי ונפוץ מאוד בישראל, הגורם למחלה קשה בכלבים.</w:t>
       </w:r>
     </w:p>
     <w:p>
@@ -29323,7 +29116,7 @@
           <w:szCs w:val="23"/>
           <w:rtl/>
         </w:rPr>
-        <w:t xml:space="preserve"> איברים שאינם מקבלים מספיק חמצן ודם מתפקדים ביעילות נמוכה, מה שעלול להאריך באופן משמעותי את משך ההתאוששות של החיה ולהשאיר אותה מטוששטת זמן רב לאחר סיום הפרוצדורה</w:t>
+        <w:t xml:space="preserve"> איברים שאינם מקבלים מספיק חמצן ודם מתפקדים ביעילות נמוכה, מה שעלול להאריך באופן משמעותי את משך ההתאוששות של החיה ולהשאיר אותה מטושטשת זמן רב לאחר סיום הפרוצדורה</w:t>
       </w:r>
     </w:p>
     <w:p>
@@ -29470,7 +29263,7 @@
           <w:szCs w:val="23"/>
           <w:rtl/>
         </w:rPr>
-        <w:t xml:space="preserve"> הסיבה השכיחה ביותר. אם חומרי ההרדמה (תרופות או איזופלורן) חלשים מדי, הגוף מגיב ללגירוי או לכאב בתגובת "הילחם או ברח", מה שמכווץ את כלי הדם ומקפיץ את לחץ הדם והדופק</w:t>
+        <w:t xml:space="preserve"> הסיבה השכיחה ביותר. אם חומרי ההרדמה (תרופות או איזופלורן) חלשים מדי, הגוף מגיב לגירוי או לכאב בתגובת "הילחם או ברח", מה שמכווץ את כלי הדם ומקפיץ את לחץ הדם והדופק</w:t>
       </w:r>
     </w:p>
     <w:p>

</xml_diff>